<commit_message>
Update authors and roles, condense abstract to 150 words, reconcile table metrics, audit references, and update word docs
</commit_message>
<xml_diff>
--- a/latex/main.docx
+++ b/latex/main.docx
@@ -120,6 +120,44 @@
                 <w:b/>
                 <w:sz w:val="18"/>
               </w:rPr>
+              <w:t>Mahad Aftab</w:t>
+              <w:br/>
+            </w:r>
+            <w:r>
+              <w:rPr>
+                <w:i/>
+                <w:sz w:val="17"/>
+              </w:rPr>
+              <w:t>Dept. of Biomedical Engineering</w:t>
+              <w:br/>
+              <w:t>Univ. of Engineering and Technology</w:t>
+              <w:br/>
+            </w:r>
+            <w:r>
+              <w:rPr>
+                <w:color w:val="374151"/>
+                <w:sz w:val="17"/>
+              </w:rPr>
+              <w:t>Lahore, Pakistan</w:t>
+              <w:br/>
+              <w:t>Mahadaftab680@gmail.com</w:t>
+            </w:r>
+          </w:p>
+        </w:tc>
+        <w:tc>
+          <w:tcPr>
+            <w:tcW w:type="dxa" w:w="2520"/>
+          </w:tcPr>
+          <w:p>
+            <w:pPr>
+              <w:spacing w:after="40" w:line="252" w:lineRule="auto"/>
+              <w:jc w:val="center"/>
+            </w:pPr>
+            <w:r>
+              <w:rPr>
+                <w:b/>
+                <w:sz w:val="18"/>
+              </w:rPr>
               <w:t>Fatima-Tu-Zahra†</w:t>
               <w:br/>
             </w:r>
@@ -144,44 +182,6 @@
             </w:r>
           </w:p>
         </w:tc>
-        <w:tc>
-          <w:tcPr>
-            <w:tcW w:type="dxa" w:w="2520"/>
-          </w:tcPr>
-          <w:p>
-            <w:pPr>
-              <w:spacing w:after="40" w:line="252" w:lineRule="auto"/>
-              <w:jc w:val="center"/>
-            </w:pPr>
-            <w:r>
-              <w:rPr>
-                <w:b/>
-                <w:sz w:val="18"/>
-              </w:rPr>
-              <w:t>Mahad Aftab†</w:t>
-              <w:br/>
-            </w:r>
-            <w:r>
-              <w:rPr>
-                <w:i/>
-                <w:sz w:val="17"/>
-              </w:rPr>
-              <w:t>Dept. of Biomedical Engineering</w:t>
-              <w:br/>
-              <w:t>Univ. of Engineering and Technology</w:t>
-              <w:br/>
-            </w:r>
-            <w:r>
-              <w:rPr>
-                <w:color w:val="374151"/>
-                <w:sz w:val="17"/>
-              </w:rPr>
-              <w:t>Lahore, Pakistan</w:t>
-              <w:br/>
-              <w:t>Mahadaftab680@gmail.com</w:t>
-            </w:r>
-          </w:p>
-        </w:tc>
       </w:tr>
     </w:tbl>
     <w:p>
@@ -193,7 +193,7 @@
           <w:i/>
           <w:sz w:val="17"/>
         </w:rPr>
-        <w:t>† Supervisors.</w:t>
+        <w:t>† Supervisor.</w:t>
       </w:r>
     </w:p>
     <w:p>
@@ -213,7 +213,7 @@
         <w:rPr>
           <w:sz w:val="18"/>
         </w:rPr>
-        <w:t>Deep learning models for medical diagnostics predominantly emphasize monolithic parameter scaling. However, in edge cardiology, mobile telemetry, and resource-constrained clinics, monolithic scaling exacerbates computational latency, memory footprints, and uncalibrated overconfidence under clinical noise. This study investigates the hypothesis that dividing a fixed parameter budget among an ensemble of compact, specialized neural networks (multiplicity) achieves superior diagnostic discrimination, probability calibration, and stress robustness compared to a single monolithic network of equivalent capacity. Using the standardized PTB-XL 12-lead electrocardiography (ECG) benchmark across 21,799 clinical records and five diagnostic superclasses, a fixed total capacity budget of ~2.0M parameters is rigorously split into homogeneous configurations (K in {1, 2, 4, 8, 16}) and a parameter-matched heterogeneous ensemble (ResNet-1D, MultiScale-CNN, TCN-1D, and ConvAttention-1D). Across five randomized seeds, the multiplicity hypothesis is confirmed: split architectures (K=2: AUROC 0.9085 ± 0.0007; K=4: 0.9084 ± 0.0009) statistically outperform the monolithic baseline (K=1: 0.9059 ± 0.0010, DeLong p = 3.63 × 10^-4). Heterogeneous inductive biases further improve discrimination (0.9110 ± 0.0007) and calibration (Brier score 0.0867 ± 0.0005 vs 0.0881 ± 0.0002) by lowering representational similarity (linear CKA 0.9008 vs 0.9458). However, an over-fragmentation boundary is identified: at K=16 (125k parameters/expert), individual capacity degrades, lowering AUROC to 0.9048 and tripling latency. Furthermore, a learned Top-2 sparse router matches dense discrimination (0.9113) while reducing computation by 28.2%, and selective abstention on the most uncertain 10% of records achieves an empirical risk reduction of 4.18%. Factorial ablation demonstrates that diversity entropy regularization is essential to prevent router collapse (0.9088 vs 0.9049).</w:t>
+        <w:t>Deep neural networks for physiological signal classification predominantly rely on monolithic parameter scaling, which incurs high computational latency and uncalibrated overconfidence under clinical noise. In resource-constrained 12-lead electrocardiogram (ECG) multi-label diagnosis across 21,799 PTB-XL records, this study investigates distributing an invariant ~2.0M parameter budget among compact specialized networks (MOSAIC-Med). The multiplicity hypothesis (H1) is validated: split architectures (K=2: AUROC 0.9085 ± 0.0007; K=4: 0.9084 ± 0.0008) statistically surpass the monolithic baseline (K=1: 0.9059 ± 0.0010, DeLong p = 3.63 × 10^-4). However, extreme over-fragmentation at K=16 degrades AUROC to 0.9048 and triples latency. Architectural diversity (H2) yields a consistent descriptive improvement trend (0.9110 ± 0.0006; Holm p = 0.058) with lower CKA similarity (0.9008 vs 0.9458), but is not statistically significant at alpha = 0.05. Learned Top-2 sparse routing (H3) achieves diagnostic parity (0.9113) while reducing computation by 28.2% relative to dense ensembling (297.8 vs 414.9 MFLOPs). Selective abstention (H4) on the 10% most uncertain records achieves a 4.18% relative risk reduction (p = 0.0093). Factorial ablation confirms diversity regularization prevents router collapse (0.9088 vs 0.9049).</w:t>
       </w:r>
     </w:p>
     <w:p>

</xml_diff>

<commit_message>
Address reviewer feedback: verify citations, reconcile Fold 10 counts, clarify DeLong tests, and fit exact 6-page limit
</commit_message>
<xml_diff>
--- a/latex/main.docx
+++ b/latex/main.docx
@@ -633,7 +633,7 @@
               <w:rPr>
                 <w:sz w:val="16"/>
               </w:rPr>
-              <w:t>17,411</w:t>
+              <w:t>17,418</w:t>
             </w:r>
           </w:p>
         </w:tc>
@@ -656,7 +656,7 @@
               <w:rPr>
                 <w:sz w:val="16"/>
               </w:rPr>
-              <w:t>15,082</w:t>
+              <w:t>15,023</w:t>
             </w:r>
           </w:p>
         </w:tc>
@@ -679,7 +679,7 @@
               <w:rPr>
                 <w:sz w:val="16"/>
               </w:rPr>
-              <w:t>59.8 ± 16.9</w:t>
+              <w:t>62.3 ± 31.4</w:t>
             </w:r>
           </w:p>
         </w:tc>
@@ -702,7 +702,7 @@
               <w:rPr>
                 <w:sz w:val="16"/>
               </w:rPr>
-              <w:t>48.1%</w:t>
+              <w:t>47.8%</w:t>
             </w:r>
           </w:p>
         </w:tc>
@@ -773,7 +773,7 @@
               <w:rPr>
                 <w:sz w:val="16"/>
               </w:rPr>
-              <w:t>1,894</w:t>
+              <w:t>1,942</w:t>
             </w:r>
           </w:p>
         </w:tc>
@@ -796,7 +796,7 @@
               <w:rPr>
                 <w:sz w:val="16"/>
               </w:rPr>
-              <w:t>59.7 ± 17.0</w:t>
+              <w:t>64.5 ± 37.1</w:t>
             </w:r>
           </w:p>
         </w:tc>
@@ -819,7 +819,7 @@
               <w:rPr>
                 <w:sz w:val="16"/>
               </w:rPr>
-              <w:t>47.9%</w:t>
+              <w:t>48.1%</w:t>
             </w:r>
           </w:p>
         </w:tc>
@@ -867,7 +867,7 @@
               <w:rPr>
                 <w:sz w:val="16"/>
               </w:rPr>
-              <w:t>2,205</w:t>
+              <w:t>2,198</w:t>
             </w:r>
           </w:p>
         </w:tc>
@@ -890,7 +890,7 @@
               <w:rPr>
                 <w:sz w:val="16"/>
               </w:rPr>
-              <w:t>1,893</w:t>
+              <w:t>1,904</w:t>
             </w:r>
           </w:p>
         </w:tc>
@@ -913,7 +913,7 @@
               <w:rPr>
                 <w:sz w:val="16"/>
               </w:rPr>
-              <w:t>59.9 ± 16.7</w:t>
+              <w:t>64.4 ± 34.2</w:t>
             </w:r>
           </w:p>
         </w:tc>
@@ -936,7 +936,7 @@
               <w:rPr>
                 <w:sz w:val="16"/>
               </w:rPr>
-              <w:t>48.0%</w:t>
+              <w:t>48.5%</w:t>
             </w:r>
           </w:p>
         </w:tc>
@@ -6244,31 +6244,7 @@
         <w:spacing w:after="100" w:line="276" w:lineRule="auto"/>
       </w:pPr>
       <w:r>
-        <w:t>Under fixed compute, capacity splitting is a variance-reduction regularizer as demonstrated by Multiplicity Superiority (H1) by dividing fixed capacity into K = 2, 4 experts outperforms monolithic scale (K = 1) [1, 12].</w:t>
-      </w:r>
-    </w:p>
-    <w:p>
-      <w:pPr>
-        <w:spacing w:after="100" w:line="276" w:lineRule="auto"/>
-      </w:pPr>
-      <w:r>
-        <w:t>Orthogonal feature representations improve calibration (Brier 0.0867 vs 0.0881) in Architectural Diversity (H2) by outperforming homogeneous ensembles, and reduce CKA similarity (0.9008 vs 0.9458) [14].</w:t>
-      </w:r>
-    </w:p>
-    <w:p>
-      <w:pPr>
-        <w:spacing w:after="100" w:line="276" w:lineRule="auto"/>
-      </w:pPr>
-      <w:r>
-        <w:t>Top-2 dynamic routing matches dense discrimination (0.9113 vs 0.9110) with a 28.2% reduction in FLOPs, while also eliminating FLOPs with edge inference efficiency.</w:t>
-      </w:r>
-    </w:p>
-    <w:p>
-      <w:pPr>
-        <w:spacing w:after="100" w:line="276" w:lineRule="auto"/>
-      </w:pPr>
-      <w:r>
-        <w:t>Selective Deferral (H4): Based on predictive entropy and ensemble disagreement, a well ordered uncertainty is obtained, monotonically decreasing the clinical diagnostic risk [8, 11].</w:t>
+        <w:t>Under an approximately fixed parameter budget, capacity splitting acts as a variance-reduction regularizer: Multiplicity Superiority (H1) is validated as dividing fixed capacity into K = 2, 4 experts statistically outperforms monolithic scale (K = 1, DeLong p = 3.63 × 10^-4) [1, 12]. In Architectural Diversity (H2), evaluating heterogeneous against homogeneous ensembles shows a consistent improvement trend (Holm p = 0.058) in discrimination and calibration (Brier 0.0867 vs 0.0881) by reducing CKA similarity (0.9008 vs 0.9458) [14], though it does not reach statistical significance at alpha = 0.05. For Sparse Adaptive Routing (H3), Top-2 dynamic routing achieves empirical discrimination comparable to dense routing (0.9113 vs 0.9110, p = 0.42) while reducing FLOPs by 28.2% relative to dense ensembling (297.8 vs 414.9 MFLOPs). Finally, under Selective Deferral (H4), combining predictive entropy and ensemble disagreement yields well-ordered uncertainty, achieving a 4.18% relative risk reduction at 90% coverage (p = 0.0093) [8, 11].</w:t>
       </w:r>
     </w:p>
     <w:p>
@@ -6291,15 +6267,7 @@
         <w:spacing w:after="100" w:line="276" w:lineRule="auto"/>
       </w:pPr>
       <w:r>
-        <w:t>Capacity Under-Allocation at K = 16: Slightly more than 125K parameters per expert, the sub-networks are not sufficiently capable of handling complex morphologies, and the sequential latency is increased by a factor of three to 6.78 ms.</w:t>
-      </w:r>
-    </w:p>
-    <w:p>
-      <w:pPr>
-        <w:spacing w:after="100" w:line="276" w:lineRule="auto"/>
-      </w:pPr>
-      <w:r>
-        <w:t>Training using diagnostic loss results in a collapse of the gating (0.9049 vs 0.9108), showing that unregularized routers are prone to collapsing prematurely into a single expert.</w:t>
+        <w:t>Capacity Under-Allocation and Gating Collapse: With only ~125K parameters per expert (K = 16), sub-networks lack capacity for multi-lead morphology extraction, tripling latency to 6.78 ms. Furthermore, training the router using diagnostic loss alone results in gating collapse into a single expert (0.9049 vs 0.9108), demonstrating that diversity regularization is essential.</w:t>
       </w:r>
     </w:p>
     <w:p>
@@ -6322,7 +6290,7 @@
         <w:spacing w:after="100" w:line="276" w:lineRule="auto"/>
       </w:pPr>
       <w:r>
-        <w:t>For memory constrained wearable monitors, Edge Cardiology &amp; Triage has included Top-2 sparse routing to reduce inference to 297.8 MFLOPs (-28.2%) in order to increase battery life. In the hospital PACS, uncertainty deferral results in triaging 90% of the tracings with very little error (10.37%) and sends up borderline cases for specialist review.</w:t>
+        <w:t>For memory-constrained monitors, Top-2 sparse routing reduces inference FLOPs by 28.2% relative to dense ensembling, while uncertainty deferral enables identifying ambiguous tracings for potential clinician overread in retrospective evaluation. These technical benchmarks demonstrate algorithmic feasibility rather than clinical efficacy or improved patient outcomes.</w:t>
       </w:r>
     </w:p>
     <w:p>
@@ -6330,7 +6298,7 @@
         <w:spacing w:after="100" w:line="276" w:lineRule="auto"/>
       </w:pPr>
       <w:r>
-        <w:t>Limitations: Assessments were performed for edge budgets (~2.0M parameters) and it remains to be seen if multiplicity benefits can be maintained at foundation scales [9, 18]. Parameter budgets are matched across arms, but inference compute is not: the Top-2 router uses 297.8 MFLOPs versus 123.9 for the monolithic baseline, and a FLOP-matched comparison is left for future work. The external-site evaluation uses a held-out subset of PTB-XL (N = 248) and is not an independent cohort. Physical hardware validation and cross institutional cohorts are warranted for future research.</w:t>
+        <w:t>Limitations: Assessments were conducted under edge parameter budgets (~2.0M parameters), and evaluating multiplicity at foundation scales is left for future work [9, 18]. Parameter budgets are matched across arms, but inference compute is not: the Top-2 router requires 297.8 MFLOPs versus 123.9 for the monolithic baseline. The site-shift evaluation uses an internal held-out subset of PTB-XL (s != 0) and does not substitute for independent external multi-hospital validation.</w:t>
       </w:r>
     </w:p>
     <w:p>
@@ -6353,7 +6321,7 @@
         <w:spacing w:after="100" w:line="276" w:lineRule="auto"/>
       </w:pPr>
       <w:r>
-        <w:t>This study validates the small-model multiplicity and architectural diversity to outperform monolithic scale in 12-lead ECG diagnosis with an invariant parameter budget. A 2.0M budget can be split across a number of inductive biases to produce better discrimination, calibration and noise-resilience than an equivalent monolithic network. A four-expert heterogeneous ensemble with sparse Top-2 routing and selective abstention offers a framework that balances edge performance and safety for clinical use.</w:t>
+        <w:t>This study demonstrates that fixed-budget model multiplicity statistically outperforms monolithic scale in 12-lead ECG diagnosis, while architectural diversity exhibits a positive descriptive improvement trend (p = 0.058). Distributing a ~2.0M parameter budget across specialized compact networks provides superior discrimination, calibration, and noise resilience over an equivalent monolithic baseline. A four-expert heterogeneous ensemble with sparse Top-2 routing and selective abstention provides an effective framework balancing edge efficiency and diagnostic reliability.</w:t>
       </w:r>
     </w:p>
     <w:p>
@@ -6415,7 +6383,7 @@
         <w:rPr>
           <w:sz w:val="17"/>
         </w:rPr>
-        <w:t>[2] Y. Geifman and R. El-Yaniv, "SelectiveNet: A deep neural network with an integrated reject option," Journal of Machine Learning Research, vol. 20, no. 189, pp. 1–31, 2019.</w:t>
+        <w:t>[2] Y. Geifman and R. El-Yaniv, "SelectiveNet: A deep neural network with an integrated reject option," in International Conference on Machine Learning (ICML), pp. 2205–2214, 2019.</w:t>
       </w:r>
     </w:p>
     <w:p>
@@ -6463,7 +6431,7 @@
         <w:rPr>
           <w:sz w:val="17"/>
         </w:rPr>
-        <w:t>[6] E. Black et al., "Predictive multiplicity in clinical machine learning models," in ACM Conference on Fairness, Accountability, and Transparency (FAccT), pp. 421–434, 2024. doi: 10.1145/3630106.3658917.</w:t>
+        <w:t>[6] E. Black, M. Raghavan, and S. Barocas, "Model multiplicity: Opportunities, concerns, and solutions," in ACM Conference on Fairness, Accountability, and Transparency (FAccT), pp. 850–863, 2022. doi: 10.1145/3531146.3533149.</w:t>
       </w:r>
     </w:p>
     <w:p>
@@ -6487,7 +6455,7 @@
         <w:rPr>
           <w:sz w:val="17"/>
         </w:rPr>
-        <w:t>[8] B. Kompa et al., "A second opinion on medical AI: When should models abstain and request clinician overread?" Lancet Digital Health, vol. 6, no. 3, pp. e215–e224, 2024. doi: 10.1016/S2589-7500(23)00248-1.</w:t>
+        <w:t>[8] B. Kompa, J. Snoek, and A. L. Beam, "Second opinion needed: Communicating uncertainty in medical machine learning," npj Digital Medicine, vol. 4, no. 1, p. 4, 2021. doi: 10.1038/s41746-020-00367-3.</w:t>
       </w:r>
     </w:p>
     <w:p>
@@ -6499,7 +6467,7 @@
         <w:rPr>
           <w:sz w:val="17"/>
         </w:rPr>
-        <w:t>[9] J. Li et al., "An electrocardiogram foundation model built on over 10 million recordings with external evaluation," arXiv preprint arXiv:2410.04104, 2024.</w:t>
+        <w:t>[9] J. Li et al., "An electrocardiogram foundation model built on over 10 million recordings with external evaluation," arXiv preprint arXiv:2410.04133, 2024.</w:t>
       </w:r>
     </w:p>
     <w:p>
@@ -6523,7 +6491,7 @@
         <w:rPr>
           <w:sz w:val="17"/>
         </w:rPr>
-        <w:t>[11] A. Argha et al., "Selective classification and dynamic escalation for reliable 12-lead ECG interpretation," IEEE Transactions on Biomedical Engineering, vol. 72, no. 1, pp. 312–323, 2025. doi: 10.1109/TBME.2024.3412098.</w:t>
+        <w:t>[11] A. Argha, H. Alinejad-Rokny, M. Baumgartner, G. Steinke, and S.-Y. Ooi, "A novel deep ensemble method for selective classification of electrocardiograms," IEEE Transactions on Biomedical Engineering, vol. 72, no. 2, pp. 577–588, 2025. doi: 10.1109/TBME.2024.3412098.</w:t>
       </w:r>
     </w:p>
     <w:p>
@@ -6559,7 +6527,7 @@
         <w:rPr>
           <w:sz w:val="17"/>
         </w:rPr>
-        <w:t>[14] K. Zhou et al., "Diversity decompositions and feature orthogonality in adversarial and collaborative ensembles," in International Conference on Machine Learning (ICML), 2025.</w:t>
+        <w:t>[14] J.-Q. Guo, M.-Z. Qian, W. Gao, and Z.-H. Zhou, "On the diversity of adversarial ensemble learning," in International Conference on Machine Learning (ICML), 2025.</w:t>
       </w:r>
     </w:p>
     <w:p>
@@ -6571,7 +6539,7 @@
         <w:rPr>
           <w:sz w:val="17"/>
         </w:rPr>
-        <w:t>[15] L. Han et al., "CogMoE: Signal quality-aware routing for physiological time-series classification," arXiv preprint arXiv:2602.08914, 2026.</w:t>
+        <w:t>[15] A. B. Shah et al., "CogMoE: Signal-quality–guided multimodal MoE for cognitive load prediction," in International Conference on Learning Representations (ICLR), 2026.</w:t>
       </w:r>
     </w:p>
     <w:p>
@@ -6583,7 +6551,7 @@
         <w:rPr>
           <w:sz w:val="17"/>
         </w:rPr>
-        <w:t>[16] Y. E. Mert et al., "Multi-label 12-lead ECG classification on the PTB-XL dataset: Evaluation of deep architectures and ensembles," arXiv preprint arXiv:2609.12803, 2026.</w:t>
+        <w:t>[16] Y. E. Mert, E. Akdoğan, and H. Üvet, "Multi-label 12-lead ECG classification on the PTB-XL dataset: A comparative evaluation of deep learning architectures and heterogeneous ensemble approaches," arXiv preprint arXiv:2609.12803, 2026.</w:t>
       </w:r>
     </w:p>
     <w:p>
@@ -6595,7 +6563,7 @@
         <w:rPr>
           <w:sz w:val="17"/>
         </w:rPr>
-        <w:t>[17] J. Wang et al., "Domain-expert-guided hybrid mixture-of-experts for robust physiological signal classification," in IEEE International Symposium on Biomedical Imaging (ISBI), pp. 1–5, 2026. doi: 10.1109/ISBI56142.2026.10423120.</w:t>
+        <w:t>[17] J. Gu et al., "Domain-expert-guided hybrid mixture-of-experts for medical AI: Integrating data-driven learning with clinical priors," in IEEE International Symposium on Biomedical Imaging (ISBI), pp. 1–5, 2026. doi: 10.1109/ISBI61048.2026.11515744.</w:t>
       </w:r>
     </w:p>
     <w:p>
@@ -6607,7 +6575,7 @@
         <w:rPr>
           <w:sz w:val="17"/>
         </w:rPr>
-        <w:t>[18] Y. Xu et al., "ECG-MoE: Mixture-of-expert electrocardiogram foundation model for multi-task signal analysis," arXiv preprint arXiv:2603.04589, 2026.</w:t>
+        <w:t>[18] Y. Xu et al., "ECG-MoE: Mixture-of-expert electrocardiogram foundation model," arXiv preprint arXiv:2603.04589, 2026.</w:t>
       </w:r>
     </w:p>
     <w:sectPr>

</xml_diff>

<commit_message>
Fix routing inconsistency, verify age metadata SDs, eliminate overclaims, and reconcile consistency check
</commit_message>
<xml_diff>
--- a/latex/main.docx
+++ b/latex/main.docx
@@ -213,7 +213,7 @@
         <w:rPr>
           <w:sz w:val="18"/>
         </w:rPr>
-        <w:t>Deep neural networks for physiological signal classification predominantly rely on monolithic parameter scaling, which incurs high computational latency and uncalibrated overconfidence under clinical noise. In resource-constrained 12-lead electrocardiogram (ECG) multi-label diagnosis across 21,799 PTB-XL records, this study investigates distributing an invariant ~2.0M parameter budget among compact specialized networks (MOSAIC-Med). The multiplicity hypothesis (H1) is validated: split architectures (K=2: AUROC 0.9085 ± 0.0007; K=4: 0.9084 ± 0.0008) statistically surpass the monolithic baseline (K=1: 0.9059 ± 0.0010, DeLong p = 3.63 × 10^-4). However, extreme over-fragmentation at K=16 degrades AUROC to 0.9048 and triples latency. Architectural diversity (H2) yields a consistent descriptive improvement trend (0.9110 ± 0.0006; Holm p = 0.058) with lower CKA similarity (0.9008 vs 0.9458), but is not statistically significant at alpha = 0.05. Learned Top-2 sparse routing (H3) achieves diagnostic parity (0.9113) while reducing computation by 28.2% relative to dense ensembling (297.8 vs 414.9 MFLOPs). Selective abstention (H4) on the 10% most uncertain records achieves a 4.18% relative risk reduction (p = 0.0093). Factorial ablation confirms diversity regularization prevents router collapse (0.9088 vs 0.9049).</w:t>
+        <w:t>Deep neural networks for physiological signal classification predominantly rely on monolithic parameter scaling, which incurs high computational latency and uncalibrated overconfidence under simulated signal stress. In resource-constrained 12-lead electrocardiogram (ECG) multi-label diagnosis across 21,799 PTB-XL records, this study investigates distributing an invariant ~2.0M parameter budget among compact specialized networks (MOSAIC-Med). The multiplicity hypothesis (H1) is validated: split architectures (K=2: AUROC 0.9085 ± 0.0007; K=4: 0.9084 ± 0.0008) statistically surpass the monolithic baseline (K=1: 0.9059 ± 0.0010, DeLong p = 3.63 × 10^-4). However, extreme over-fragmentation at K=16 degrades AUROC to 0.9048 and triples latency. Architectural diversity (H2) yields a consistent descriptive improvement trend (0.9110 ± 0.0006; Holm p = 0.058) with lower CKA similarity (0.9008 vs 0.9458), but is not statistically significant at alpha = 0.05. Learned Top-2 sparse routing (H3) achieves competitive discrimination (0.9113) while reducing computation by 28.2% relative to dense ensembling (297.8 vs 414.9 MFLOPs). Selective abstention (H4) on the 10% most uncertain records reduces multi-label Hamming risk among retained records by 4.18% (p = 0.0093). Factorial ablation confirms diversity regularization prevents router collapse (0.9088 vs 0.9049).</w:t>
       </w:r>
     </w:p>
     <w:p>
@@ -560,7 +560,7 @@
                 <w:b/>
                 <w:sz w:val="16"/>
               </w:rPr>
-              <w:t>Age (SD)</w:t>
+              <w:t>Age (SD)*</w:t>
             </w:r>
           </w:p>
         </w:tc>
@@ -679,7 +679,7 @@
               <w:rPr>
                 <w:sz w:val="16"/>
               </w:rPr>
-              <w:t>62.3 ± 31.4</w:t>
+              <w:t>59.4 ± 16.6</w:t>
             </w:r>
           </w:p>
         </w:tc>
@@ -796,7 +796,7 @@
               <w:rPr>
                 <w:sz w:val="16"/>
               </w:rPr>
-              <w:t>64.5 ± 37.1</w:t>
+              <w:t>59.9 ± 17.1</w:t>
             </w:r>
           </w:p>
         </w:tc>
@@ -913,7 +913,7 @@
               <w:rPr>
                 <w:sz w:val="16"/>
               </w:rPr>
-              <w:t>64.4 ± 34.2</w:t>
+              <w:t>60.7 ± 17.3</w:t>
             </w:r>
           </w:p>
         </w:tc>
@@ -952,7 +952,7 @@
         <w:spacing w:after="100" w:line="276" w:lineRule="auto"/>
       </w:pPr>
       <w:r>
-        <w:t>As documented in Table I and illustrated in Boxes 1–5 of Fig. 1, records are partitioned using the official patient-stratified 10-fold split: Folds 1–8 for training, Fold 9 for validation, and Fold 10 strictly held out for final testing, guaranteeing zero patient identity leakage [5]. Diagnostic classification is framed as multi-label binary prediction across five clinical superclasses: Normal ECG (NORM), Myocardial Infarction (MI), ST/T Changes (STTC), Conduction Defect (CD), and Hypertrophy (HYP). Let x in R^{C x L} denote an input 12-lead recording (C = 12, L = 1000), and let y in {0, 1}^M denote the binary target vector for M = 5 superclasses. All signals are zero-mean unit-variance normalized per lead: x_c' = (x_c - mu_c) / sigma_c.</w:t>
+        <w:t>As documented in Table I and illustrated in Boxes 1–5 of Fig. 1, records are partitioned using the official patient-stratified 10-fold split: Folds 1–8 for training, Fold 9 for validation, and Fold 10 strictly held out for final testing, guaranteeing zero patient identity leakage [5]. Reported ages exclude 293 records with legacy sentinel age 300 (N=21,506 valid), which otherwise inflate raw metadata SDs to 31.4, 37.1, and 34.2 years, respectively. Diagnostic classification is framed as multi-label binary prediction across five clinical superclasses: Normal ECG (NORM), Myocardial Infarction (MI), ST/T Changes (STTC), Conduction Defect (CD), and Hypertrophy (HYP). Let x in R^{C x L} denote an input 12-lead recording (C = 12, L = 1000), and let y in {0, 1}^M denote the binary target vector for M = 5 superclasses. All signals are standardized instance-by-instance across time (L = 1000) independently per lead.</w:t>
       </w:r>
     </w:p>
     <w:p>
@@ -2247,7 +2247,7 @@
         <w:spacing w:after="100" w:line="276" w:lineRule="auto"/>
       </w:pPr>
       <w:r>
-        <w:t>The underlying mathematical mechanism driving this gain is ensemble variance reduction under fixed aggregate compute: intermediate capacity splitting (K=2, 4) reduces idiosyncratic estimation error across diverse patient morphologies without reducing individual network capacity below the minimum threshold required to extract morphological 12-lead features. However, scaling to K=16 triggers an acute capacity over-fragmentation boundary. When the 2.0M budget is divided among 16 sub-networks, individual models receive only ~125K parameters (W_16=16). At this impoverished capacity, individual networks lack the receptive field depth and spatial filter diversity needed to resolve subtle ST-elevation or multi-lead QRS changes. This results in the individual sub-networks' feature quality eroded and lowers the AUROC of the ensemble to 0.9048 ± 0.0005 (which falls below that of the monolithic baseline) and sequential latency of the ensemble is tripled to 6.78 ms.</w:t>
+        <w:t>The underlying mathematical mechanism driving this gain is ensemble variance reduction under an approximately fixed aggregate parameter budget: intermediate capacity splitting (K=2, 4) reduces idiosyncratic estimation error across diverse patient morphologies without reducing individual network capacity below the minimum threshold required to extract morphological 12-lead features. However, scaling to K=16 triggers an acute capacity over-fragmentation boundary. When the 2.0M budget is divided among 16 sub-networks, individual models receive only ~125K parameters (W_16=16). At this impoverished capacity, individual networks lack the receptive field depth and spatial filter diversity needed to resolve subtle ST-elevation or multi-lead QRS changes. This results in the individual sub-networks' feature quality eroded and lowers the AUROC of the ensemble to 0.9048 ± 0.0005 (which falls below that of the monolithic baseline) and sequential latency of the ensemble is tripled to 6.78 ms.</w:t>
       </w:r>
     </w:p>
     <w:p>
@@ -3608,7 +3608,7 @@
         <w:spacing w:after="100" w:line="276" w:lineRule="auto"/>
       </w:pPr>
       <w:r>
-        <w:t>The dense learned Adaptive Router (16K parameters) performs at peak absolute discrimination (0.9118 ± 0.0004, Holm p = 5.27 × 10^-5) at 414.9 MFLOPs. Importantly, the proposed Sparse Top-2 Router still maintains this discrimination (0.9113 ± 0.0008, Holm p = 5.07 × 10^-5) but with just two experts being executed per patient tracing, which reduces inference compute to 297.8 MFLOPs (down 28.2% from dense routing).</w:t>
+        <w:t>The dense learned Adaptive Router (16K parameters) performs at peak discrimination (0.9118 ± 0.0004, Holm p = 5.27 × 10^-5) at 414.9 MFLOPs. The Sparse Top-2 Router achieves empirical discrimination of 0.9113 ± 0.0008 (Holm p = 5.07 × 10^-5 vs. monolithic) with two active experts per tracing, reducing dynamic inference compute to 297.8 MFLOPs (a 28.2% reduction relative to dense routing; 2.40x monolithic FLOPs). Across training seeds, the minor numerical difference between dense routing and sparse Top-2 (0.9118 vs. 0.9113, paired p = 0.163) is not statistically significant, though this descriptive proximity does not establish formal equivalence.</w:t>
       </w:r>
     </w:p>
     <w:p>
@@ -3616,7 +3616,7 @@
         <w:spacing w:after="100" w:line="276" w:lineRule="auto"/>
       </w:pPr>
       <w:r>
-        <w:t>The router specializes in medically informed cardiac pathologies: For Conduction Defects (CD) and Hypertrophy (HYP), the majority of the router sends the TCN-1D and MultiScale-CNN (w_k &gt; 0.30), which use dilated convolutions to assess the PR interval, bundle branch blocks and the ventricular voltage criteria, respectively.</w:t>
+        <w:t>The router specializes in cardiac pathologies: Conduction Defects (CD) and Hypertrophy (HYP) predominantly activate TCN-1D and MultiScale-CNN (w_k &gt; 0.30), leveraging dilated convolutions for PR intervals, bundle branch blocks, and ventricular voltage criteria.</w:t>
       </w:r>
     </w:p>
     <w:p>
@@ -3624,7 +3624,7 @@
         <w:spacing w:after="100" w:line="276" w:lineRule="auto"/>
       </w:pPr>
       <w:r>
-        <w:t>On the other hand, ResNet-1D and ConvAttention-1D have dominant gating weights (w_k &gt; 0.28) thanks to their particular focus on localized ST-segment elevations and multi-lead reciprocal depression in the case of MI and ST/T changes (STTC). Two lowest-relevance models are dynamically removed for each patient, without loss of diagnostic information, and without unnecessary computation.</w:t>
+        <w:t>Conversely, ResNet-1D and ConvAttention-1D exhibit dominant gating weights (w_k &gt; 0.28) for localized ST-elevations and reciprocal depression in MI and STTC. Two lowest-relevance models are dynamically bypassed per patient, maintaining discrimination (0.9113) close to dense 4-expert routing (0.9118).</w:t>
       </w:r>
     </w:p>
     <w:p>
@@ -3639,7 +3639,7 @@
           <w:color w:val="1F2937"/>
           <w:sz w:val="20"/>
         </w:rPr>
-        <w:t>D. Clinical Robustness Under Degradation and Domain Shift</w:t>
+        <w:t>D. Robustness Under Simulated Stress Tests and Internal Domain Shift</w:t>
       </w:r>
     </w:p>
     <w:p>
@@ -3647,7 +3647,7 @@
         <w:spacing w:after="100" w:line="276" w:lineRule="auto"/>
       </w:pPr>
       <w:r>
-        <w:t>Table V and Fig. 3 report diagnostic retention across five clinical stress tests and real-world domain shift across all five random seeds.</w:t>
+        <w:t>Table V and Fig. 3 report diagnostic retention across five predefined simulated stress tests and internal domain shift across all five random seeds.</w:t>
       </w:r>
     </w:p>
     <w:p>
@@ -3701,7 +3701,7 @@
           <w:color w:val="374151"/>
           <w:sz w:val="17"/>
         </w:rPr>
-        <w:t>Fig. 3. Diagnostic retention under real-world clinical corruptions and site domain shift across five seeds (mean ± SD). Staggered percentage annotations indicate macro AUROC retention relative to clean baseline without text collision.</w:t>
+        <w:t>Fig. 3. Diagnostic retention under predefined simulated stress tests and internal site domain shift across five seeds (mean ± SD). Staggered percentage annotations indicate macro AUROC retention relative to clean baseline without text collision.</w:t>
       </w:r>
     </w:p>
     <w:p>
@@ -3762,7 +3762,7 @@
                 <w:b/>
                 <w:sz w:val="16"/>
               </w:rPr>
-              <w:t>Clinical Degradation</w:t>
+              <w:t>Perturbation Condition</w:t>
             </w:r>
           </w:p>
         </w:tc>
@@ -3887,7 +3887,7 @@
               <w:rPr>
                 <w:sz w:val="16"/>
               </w:rPr>
-              <w:t>Clean Test Baseline</w:t>
+              <w:t>Clean Baseline</w:t>
             </w:r>
           </w:p>
         </w:tc>
@@ -4473,7 +4473,7 @@
               <w:rPr>
                 <w:sz w:val="16"/>
               </w:rPr>
-              <w:t>External Site (s != 0)</w:t>
+              <w:t>Held-Out Site (s != 0)</w:t>
             </w:r>
           </w:p>
         </w:tc>
@@ -6206,7 +6206,7 @@
         <w:spacing w:after="100" w:line="276" w:lineRule="auto"/>
       </w:pPr>
       <w:r>
-        <w:t>With diversity entropy regularization (L_div) it is possible to recover the AUROC to 0.9088 ± 0.0015, which introduces an exploratory balance. The complete formulation (L_diag + L_div + L_fail) gets 0.9090 ± 0.0013 (Brier 0.0879), regularizing gating dynamics without manual tuning of the thresholds. Multiplicity (0.9059), diversity (0.9110), routing (0.9113), and 90% selective deferral successively improve diagnostic discrimination starting from SingleLarge (0.9059).</w:t>
+        <w:t>With diversity entropy regularization (L_div) it is possible to recover the AUROC to 0.9088 ± 0.0015, which introduces an exploratory balance. The complete formulation (L_diag + L_div + L_fail) gets 0.9090 ± 0.0013 (Brier 0.0879), regularizing gating dynamics without manual tuning of the thresholds. Multiplicity (K=2: 0.9085), diversity (0.9110), and routing (0.9113) enhance discrimination relative to SingleLarge (0.9059), while 90% selective deferral reduces retained Hamming risk (10.83% -&gt; 10.37%).</w:t>
       </w:r>
     </w:p>
     <w:p>
@@ -6244,7 +6244,7 @@
         <w:spacing w:after="100" w:line="276" w:lineRule="auto"/>
       </w:pPr>
       <w:r>
-        <w:t>Under an approximately fixed parameter budget, capacity splitting acts as a variance-reduction regularizer: Multiplicity Superiority (H1) is validated as dividing fixed capacity into K = 2, 4 experts statistically outperforms monolithic scale (K = 1, DeLong p = 3.63 × 10^-4) [1, 12]. In Architectural Diversity (H2), evaluating heterogeneous against homogeneous ensembles shows a consistent improvement trend (Holm p = 0.058) in discrimination and calibration (Brier 0.0867 vs 0.0881) by reducing CKA similarity (0.9008 vs 0.9458) [14], though it does not reach statistical significance at alpha = 0.05. For Sparse Adaptive Routing (H3), Top-2 dynamic routing achieves empirical discrimination comparable to dense routing (0.9113 vs 0.9110, p = 0.42) while reducing FLOPs by 28.2% relative to dense ensembling (297.8 vs 414.9 MFLOPs). Finally, under Selective Deferral (H4), combining predictive entropy and ensemble disagreement yields well-ordered uncertainty, achieving a 4.18% relative risk reduction at 90% coverage (p = 0.0093) [8, 11].</w:t>
+        <w:t>Under an approximately fixed parameter budget, capacity splitting acts as a variance-reduction regularizer: Multiplicity Superiority (H1) is validated as dividing fixed capacity into K = 2, 4 experts statistically outperforms monolithic scale (K = 1, DeLong p = 3.63 × 10^-4) [1, 12]. In Architectural Diversity (H2), evaluating heterogeneous against homogeneous ensembles shows a consistent improvement trend (Holm p = 0.058) in discrimination and calibration (Brier 0.0867 vs 0.0881) by reducing CKA similarity (0.9008 vs 0.9458) [14], though it does not reach statistical significance at alpha = 0.05. For Sparse Adaptive Routing (H3), Top-2 dynamic routing achieves competitive discrimination (0.9113 ± 0.0008 vs. dense routing 0.9118 ± 0.0004; paired p = 0.163) while reducing FLOPs by 28.2% relative to dense ensembling (297.8 vs 414.9 MFLOPs), without implying formal statistical equivalence. Finally, under Selective Deferral (H4), combining predictive entropy and ensemble disagreement yields well-ordered uncertainty, achieving a 4.18% relative risk reduction in retained Hamming error at 90% coverage (p = 0.0093) [8, 11].</w:t>
       </w:r>
     </w:p>
     <w:p>
@@ -6267,7 +6267,7 @@
         <w:spacing w:after="100" w:line="276" w:lineRule="auto"/>
       </w:pPr>
       <w:r>
-        <w:t>Capacity Under-Allocation and Gating Collapse: With only ~125K parameters per expert (K = 16), sub-networks lack capacity for multi-lead morphology extraction, tripling latency to 6.78 ms. Furthermore, training the router using diagnostic loss alone results in gating collapse into a single expert (0.9049 vs 0.9108), demonstrating that diversity regularization is essential.</w:t>
+        <w:t>Capacity Under-Allocation and Gating Collapse: At K = 16 (~125K parameters/expert), sub-networks lack capacity for multi-lead morphology extraction, tripling latency to 6.78 ms. Furthermore, training the router using diagnostic loss alone results in gating collapse into a single expert (0.9049 vs 0.9108), demonstrating that diversity regularization is essential.</w:t>
       </w:r>
     </w:p>
     <w:p>
@@ -6282,7 +6282,7 @@
           <w:color w:val="1F2937"/>
           <w:sz w:val="20"/>
         </w:rPr>
-        <w:t>C. Clinical Translation and Limitations</w:t>
+        <w:t>C. Practical Deployment Implications and Limitations</w:t>
       </w:r>
     </w:p>
     <w:p>
@@ -6290,7 +6290,7 @@
         <w:spacing w:after="100" w:line="276" w:lineRule="auto"/>
       </w:pPr>
       <w:r>
-        <w:t>For memory-constrained monitors, Top-2 sparse routing reduces inference FLOPs by 28.2% relative to dense ensembling, while uncertainty deferral enables identifying ambiguous tracings for potential clinician overread in retrospective evaluation. These technical benchmarks demonstrate algorithmic feasibility rather than clinical efficacy or improved patient outcomes.</w:t>
+        <w:t>For resource-constrained devices, Top-2 sparse routing cuts inference FLOPs by 28.2% relative to dense ensembling, while uncertainty deferral isolates ambiguous tracings for potential clinician overread in retrospective evaluation. These benchmarks demonstrate technical feasibility rather than clinical efficacy or improved patient outcomes.</w:t>
       </w:r>
     </w:p>
     <w:p>
@@ -6298,7 +6298,7 @@
         <w:spacing w:after="100" w:line="276" w:lineRule="auto"/>
       </w:pPr>
       <w:r>
-        <w:t>Limitations: Assessments were conducted under edge parameter budgets (~2.0M parameters), and evaluating multiplicity at foundation scales is left for future work [9, 18]. Parameter budgets are matched across arms, but inference compute is not: the Top-2 router requires 297.8 MFLOPs versus 123.9 for the monolithic baseline. The site-shift evaluation uses an internal held-out subset of PTB-XL (s != 0) and does not substitute for independent external multi-hospital validation.</w:t>
+        <w:t>Limitations: Assessments were conducted under edge parameter budgets (~2.0M parameters), and evaluating multiplicity at foundation scales is left for future work [9, 18]. Parameter budgets are matched across arms, but inference compute is not: the Top-2 router requires 297.8 MFLOPs versus 123.9 for the monolithic baseline. Crucially, the site-shift evaluation uses an internal held-out subset of PTB-XL (s != 0) and does not substitute for independent external multi-hospital validation.</w:t>
       </w:r>
     </w:p>
     <w:p>

</xml_diff>

<commit_message>
Enforce strict IEEE template page boundaries on Page 6, eliminate \enlargethispage, and synchronize documents
</commit_message>
<xml_diff>
--- a/latex/main.docx
+++ b/latex/main.docx
@@ -5444,7 +5444,7 @@
         <w:spacing w:after="100" w:line="276" w:lineRule="auto"/>
       </w:pPr>
       <w:r>
-        <w:t>Table VII presents the factorial ablation of router regularization across three seeds on frozen experts with cached logits.</w:t>
+        <w:t>Table VII presents the factorial ablation of router regularization across three seeds (42--44) on frozen expert backbones with cached logits (Holm-corrected across m = 4). In contrast, end-to-end evaluations in Tables III and IV utilize five seeds (42--46). Diversity entropy regularization (L_div) recovers AUROC to 0.9088 ± 0.0015; the complete formulation (L_diag + L_div + L_fail) achieves 0.9090 ± 0.0013, preventing gating collapse and regularizing dynamic routing.</w:t>
       </w:r>
     </w:p>
     <w:p>
@@ -6203,14 +6203,6 @@
     </w:p>
     <w:p>
       <w:pPr>
-        <w:spacing w:after="100" w:line="276" w:lineRule="auto"/>
-      </w:pPr>
-      <w:r>
-        <w:t>With diversity entropy regularization (L_div) it is possible to recover the AUROC to 0.9088 ± 0.0015, which introduces an exploratory balance. The complete formulation (L_diag + L_div + L_fail) gets 0.9090 ± 0.0013 (Brier 0.0879), regularizing gating dynamics without manual tuning of the thresholds. Multiplicity (K=2: 0.9085), diversity (0.9110), and routing (0.9113) enhance discrimination relative to SingleLarge (0.9059), while 90% selective deferral reduces retained Hamming risk (10.83% -&gt; 10.37%).</w:t>
-      </w:r>
-    </w:p>
-    <w:p>
-      <w:pPr>
         <w:keepNext/>
         <w:spacing w:before="280" w:after="80"/>
         <w:jc w:val="center"/>
@@ -6267,7 +6259,7 @@
         <w:spacing w:after="100" w:line="276" w:lineRule="auto"/>
       </w:pPr>
       <w:r>
-        <w:t>Capacity Under-Allocation and Gating Collapse: At K = 16 (~125K parameters/expert), sub-networks lack capacity for multi-lead morphology extraction, tripling latency to 6.78 ms. Furthermore, training the router using diagnostic loss alone results in gating collapse into a single expert (0.9049 vs 0.9108), demonstrating that diversity regularization is essential.</w:t>
+        <w:t>Capacity Under-Allocation and Gating Collapse: At K = 16 (~125K parameters/expert), sub-networks lack capacity for multi-lead morphology extraction, tripling latency to 6.78 ms. Furthermore, training the router using diagnostic loss alone collapses into a single expert (0.9049 vs 0.9108), demonstrating that diversity regularization is essential.</w:t>
       </w:r>
     </w:p>
     <w:p>
@@ -6290,15 +6282,7 @@
         <w:spacing w:after="100" w:line="276" w:lineRule="auto"/>
       </w:pPr>
       <w:r>
-        <w:t>For resource-constrained devices, Top-2 sparse routing cuts inference FLOPs by 28.2% relative to dense ensembling, while uncertainty deferral isolates ambiguous tracings for potential clinician overread in retrospective evaluation. These benchmarks demonstrate technical feasibility rather than clinical efficacy or improved patient outcomes.</w:t>
-      </w:r>
-    </w:p>
-    <w:p>
-      <w:pPr>
-        <w:spacing w:after="100" w:line="276" w:lineRule="auto"/>
-      </w:pPr>
-      <w:r>
-        <w:t>Limitations: Assessments were conducted under edge parameter budgets (~2.0M parameters), and evaluating multiplicity at foundation scales is left for future work [9, 18]. Parameter budgets are matched across arms, but inference compute is not: the Top-2 router requires 297.8 MFLOPs versus 123.9 for the monolithic baseline. Crucially, the site-shift evaluation uses an internal held-out subset of PTB-XL (s != 0) and does not substitute for independent external multi-hospital validation.</w:t>
+        <w:t>For resource-constrained devices, Top-2 sparse routing cuts inference FLOPs by 28.2% relative to dense ensembling, while uncertainty deferral isolates ambiguous tracings for clinician review. These benchmarks demonstrate technical feasibility rather than clinical efficacy. Limitations: Assessments were conducted under edge parameter budgets (~2.0M parameters); evaluating foundation scales is left for future work [9, 18]. Parameter budgets are matched across arms, but inference compute is not: Top-2 requires 297.8 MFLOPs versus 123.9 for baseline. Crucially, the site-shift evaluation uses an internal held-out subset of PTB-XL (s != 0) and does not substitute for independent external multi-hospital validation.</w:t>
       </w:r>
     </w:p>
     <w:p>
@@ -6321,7 +6305,7 @@
         <w:spacing w:after="100" w:line="276" w:lineRule="auto"/>
       </w:pPr>
       <w:r>
-        <w:t>This study demonstrates that fixed-budget model multiplicity statistically outperforms monolithic scale in 12-lead ECG diagnosis, while architectural diversity exhibits a positive descriptive improvement trend (p = 0.058). Distributing a ~2.0M parameter budget across specialized compact networks provides superior discrimination, calibration, and noise resilience over an equivalent monolithic baseline. A four-expert heterogeneous ensemble with sparse Top-2 routing and selective abstention provides an effective framework balancing edge efficiency and diagnostic reliability.</w:t>
+        <w:t>This study demonstrates that fixed-budget model multiplicity statistically outperforms monolithic scale in 12-lead ECG diagnosis, while architectural diversity exhibits a consistent descriptive improvement trend (p = 0.058). Distributing a ~2.0M parameter budget across compact specialized networks balances edge efficiency and diagnostic reliability.</w:t>
       </w:r>
     </w:p>
     <w:p>
@@ -6344,7 +6328,7 @@
         <w:spacing w:after="100" w:line="276" w:lineRule="auto"/>
       </w:pPr>
       <w:r>
-        <w:t>The PTB-XL dataset is publicly available at https://physionet.org/content/ptb-xl/1.0.3/ [4]. All code, configurations and scripts to reproduce the tables and figures are available at https://github.com/Sibgha-faisal-khan-BME/MOSAIC-Med.</w:t>
+        <w:t>The PTB-XL dataset is publicly available at https://physionet.org/content/ptb-xl/1.0.3/ [4]. Experiment code and reproduction scripts are available at https://github.com/Sibgha-faisal-khan-BME/MOSAIC-Med.</w:t>
       </w:r>
     </w:p>
     <w:p>

</xml_diff>